<commit_message>
feat: sematkan gambar denah tata letak kedai ruko ke docx Bab IV dan pptx Slide 12
</commit_message>
<xml_diff>
--- a/01_TUGAS_FINAL_BAKMI_MIMU/Laporan_SKB_Bakmi_Mimu_Carina_Sayang.docx
+++ b/01_TUGAS_FINAL_BAKMI_MIMU/Laporan_SKB_Bakmi_Mimu_Carina_Sayang.docx
@@ -7477,6 +7477,46 @@
     </w:p>
     <w:p>
       <w:pPr>
+        <w:spacing w:line="240" w:lineRule="auto" w:after="80" w:before="160"/>
+        <w:jc w:val="center"/>
+      </w:pPr>
+      <w:r>
+        <w:drawing>
+          <wp:inline xmlns:a="http://schemas.openxmlformats.org/drawingml/2006/main" xmlns:pic="http://schemas.openxmlformats.org/drawingml/2006/picture">
+            <wp:extent cx="5486400" cy="1414462"/>
+            <wp:docPr id="2" name="Picture 2"/>
+            <wp:cNvGraphicFramePr>
+              <a:graphicFrameLocks noChangeAspect="1"/>
+            </wp:cNvGraphicFramePr>
+            <a:graphic>
+              <a:graphicData uri="http://schemas.openxmlformats.org/drawingml/2006/picture">
+                <pic:pic>
+                  <pic:nvPicPr>
+                    <pic:cNvPr id="0" name="denah_tata_letak_ruko.png"/>
+                    <pic:cNvPicPr/>
+                  </pic:nvPicPr>
+                  <pic:blipFill>
+                    <a:blip r:embed="rId10"/>
+                    <a:stretch>
+                      <a:fillRect/>
+                    </a:stretch>
+                  </pic:blipFill>
+                  <pic:spPr>
+                    <a:xfrm>
+                      <a:off x="0" y="0"/>
+                      <a:ext cx="5486400" cy="1414462"/>
+                    </a:xfrm>
+                    <a:prstGeom prst="rect"/>
+                  </pic:spPr>
+                </pic:pic>
+              </a:graphicData>
+            </a:graphic>
+          </wp:inline>
+        </w:drawing>
+      </w:r>
+    </w:p>
+    <w:p>
+      <w:pPr>
         <w:spacing w:line="276" w:lineRule="auto" w:after="200" w:before="80"/>
         <w:jc w:val="center"/>
       </w:pPr>
@@ -7486,7 +7526,7 @@
           <w:b/>
           <w:sz w:val="22"/>
         </w:rPr>
-        <w:t>Gambar 4.1 Layout Bakmi Mimu Carina Sayang</w:t>
+        <w:t>Gambar 4.1 Denah Tata Letak Kedai Ruko 1 Lantai Bakmi Mimu Carina Sayang</w:t>
       </w:r>
     </w:p>
     <w:p>
@@ -7499,183 +7539,72 @@
           <w:rFonts w:ascii="Times New Roman" w:hAnsi="Times New Roman"/>
           <w:sz w:val="24"/>
         </w:rPr>
-        <w:t>Tata letak ruangan Bakmi Mimu Carina Sayang dirancang mengutamakan kebersihan, kelancaran arus staf dapur, dan kenyamanan pengunjung bersantap:</w:t>
+        <w:t>Tata letak (layout) ruangan Bakmi Mimu Carina Sayang dirancang dengan prinsip ergonomi alur kerja (workflow ergonomics) dan efisiensi ruang ruko satu lantai berdimensi memanjang. Penataan ruang menerapkan sistem arus satu arah (straight-line flow) dari akses masuk depan menuju ruang santap utama dan area servis belakang, guna meminimalisasi tabrakan arus antara pengunjung dan staf operasional:</w:t>
       </w:r>
     </w:p>
     <w:p>
       <w:pPr>
         <w:spacing w:line="360" w:lineRule="auto" w:after="120" w:before="0"/>
-        <w:ind w:left="360"/>
         <w:jc w:val="both"/>
       </w:pPr>
       <w:r>
         <w:rPr>
           <w:rFonts w:ascii="Times New Roman" w:hAnsi="Times New Roman"/>
-          <w:b/>
           <w:sz w:val="24"/>
         </w:rPr>
-        <w:t xml:space="preserve">- </w:t>
+        <w:t>1. Area Depan &amp; Teras (Dapur Semi-Terbuka / Open Kitchen &amp; Dine-In Luar): Terletak di bagian depan sebelum rolling door sebagai titik kontak pertama pelanggan. Dilengkapi etalase kaca gerobak utama untuk meracik mie, stasiun kompor gas perebusan bertemperatur tinggi, meja kuah kaldu, dispenser tempat minum, kulkas penyimpanan sayuran dan bahan segar harian, serta meja persiapan sayur dan pangsit. Pada sisi seberang teras disediakan 1 meja makan dengan 4 kursi santap luar (juga difungsikan sebagai waiting area pesanan take-away), 1 unit freezer pembeku stok daging, serta rak perlengkapan sanitasi dan kipas angin teras.</w:t>
       </w:r>
+    </w:p>
+    <w:p>
+      <w:pPr>
+        <w:spacing w:line="360" w:lineRule="auto" w:after="120" w:before="0"/>
+        <w:jc w:val="both"/>
+      </w:pPr>
       <w:r>
         <w:rPr>
           <w:rFonts w:ascii="Times New Roman" w:hAnsi="Times New Roman"/>
           <w:sz w:val="24"/>
         </w:rPr>
-        <w:t>Area Dapur Terbuka (Open Kitchen) dengan Gerobak Etalase di Bagian Depan Ruko</w:t>
+        <w:t>2. Rolling Door (Partisi Fleksibel Ruang): Berfungsi sebagai sekat pembatas fungsional antara area dapur depan dengan ruang makan dalam. Rolling door dibuka penuh pada jam sibuk dan dapat ditutup sebagian saat malam hari untuk menjaga kestabilan sirkulasi udara serta mencegah debu jalan masuk ke ruang makan utama.</w:t>
       </w:r>
     </w:p>
     <w:p>
       <w:pPr>
         <w:spacing w:line="360" w:lineRule="auto" w:after="120" w:before="0"/>
-        <w:ind w:left="360"/>
         <w:jc w:val="both"/>
       </w:pPr>
       <w:r>
         <w:rPr>
           <w:rFonts w:ascii="Times New Roman" w:hAnsi="Times New Roman"/>
-          <w:b/>
           <w:sz w:val="24"/>
         </w:rPr>
-        <w:t xml:space="preserve">- </w:t>
+        <w:t>3. Area Makan Utama (Indoor Dining Room - 19 Kursi Santap): Ruang makan utama yang nyaman dan terlindung, dilengkapi 3 unit meja makan reguler berkapasitas 4 orang per meja (total 12 kursi) di sisi atas serta 1 unit meja makan dinding memanjang dengan 7 kursi sejajar di sisi bawah yang sangat ramah bagi pelanggan individu (solo diner). Sirkulasi udara ditunjang 6 unit kipas angin dinding untuk menjaga kenyamanan pengunjung tanpa membebani biaya listrik pendingin AC berlebihan.</w:t>
       </w:r>
+    </w:p>
+    <w:p>
+      <w:pPr>
+        <w:spacing w:line="360" w:lineRule="auto" w:after="120" w:before="0"/>
+        <w:jc w:val="both"/>
+      </w:pPr>
       <w:r>
         <w:rPr>
           <w:rFonts w:ascii="Times New Roman" w:hAnsi="Times New Roman"/>
           <w:sz w:val="24"/>
         </w:rPr>
-        <w:t>Area Dine-in Ruko 1 Lantai Berkapasitas Maksimal 22 Kursi (4 Meja Pendek + Meja Panjang Dinding)</w:t>
+        <w:t>4. Area Servis &amp; Fasilitas Sanitasi Belakang: Terletak di ujung belakang ruko secara terpisah demi menjamin higienitas pangan. Terdiri dari meja barang untuk penataan inventaris alat makan bersih dan kemasan take-away, wastafel cuci tangan higienis bagi pelanggan, serta 1 unit kamar mandi/toilet bersih tertutup.</w:t>
       </w:r>
     </w:p>
     <w:p>
       <w:pPr>
         <w:spacing w:line="360" w:lineRule="auto" w:after="120" w:before="0"/>
-        <w:ind w:left="360"/>
         <w:jc w:val="both"/>
       </w:pPr>
       <w:r>
         <w:rPr>
           <w:rFonts w:ascii="Times New Roman" w:hAnsi="Times New Roman"/>
-          <w:b/>
           <w:sz w:val="24"/>
         </w:rPr>
-        <w:t xml:space="preserve">- </w:t>
-      </w:r>
-      <w:r>
-        <w:rPr>
-          <w:rFonts w:ascii="Times New Roman" w:hAnsi="Times New Roman"/>
-          <w:sz w:val="24"/>
-        </w:rPr>
-        <w:t>Fasilitas Pendingin 6 Unit Kipas Angin Dinding (Bebas Gerah Alami, Tanpa AC)</w:t>
-      </w:r>
-    </w:p>
-    <w:p>
-      <w:pPr>
-        <w:spacing w:line="360" w:lineRule="auto" w:after="120" w:before="0"/>
-        <w:ind w:left="360"/>
-        <w:jc w:val="both"/>
-      </w:pPr>
-      <w:r>
-        <w:rPr>
-          <w:rFonts w:ascii="Times New Roman" w:hAnsi="Times New Roman"/>
-          <w:b/>
-          <w:sz w:val="24"/>
-        </w:rPr>
-        <w:t xml:space="preserve">- </w:t>
-      </w:r>
-      <w:r>
-        <w:rPr>
-          <w:rFonts w:ascii="Times New Roman" w:hAnsi="Times New Roman"/>
-          <w:sz w:val="24"/>
-        </w:rPr>
-        <w:t>Area Kasir Pemesanan Manual &amp; Showcase Minuman Botol Dingin</w:t>
-      </w:r>
-    </w:p>
-    <w:p>
-      <w:pPr>
-        <w:spacing w:line="360" w:lineRule="auto" w:after="120" w:before="0"/>
-        <w:ind w:left="360"/>
-        <w:jc w:val="both"/>
-      </w:pPr>
-      <w:r>
-        <w:rPr>
-          <w:rFonts w:ascii="Times New Roman" w:hAnsi="Times New Roman"/>
-          <w:b/>
-          <w:sz w:val="24"/>
-        </w:rPr>
-        <w:t xml:space="preserve">- </w:t>
-      </w:r>
-      <w:r>
-        <w:rPr>
-          <w:rFonts w:ascii="Times New Roman" w:hAnsi="Times New Roman"/>
-          <w:sz w:val="24"/>
-        </w:rPr>
-        <w:t>Dapur Persiapan Belakang &amp; Pencucian Alat Makan</w:t>
-      </w:r>
-    </w:p>
-    <w:p>
-      <w:pPr>
-        <w:spacing w:line="360" w:lineRule="auto" w:after="120" w:before="0"/>
-        <w:ind w:left="360"/>
-        <w:jc w:val="both"/>
-      </w:pPr>
-      <w:r>
-        <w:rPr>
-          <w:rFonts w:ascii="Times New Roman" w:hAnsi="Times New Roman"/>
-          <w:b/>
-          <w:sz w:val="24"/>
-        </w:rPr>
-        <w:t xml:space="preserve">- </w:t>
-      </w:r>
-      <w:r>
-        <w:rPr>
-          <w:rFonts w:ascii="Times New Roman" w:hAnsi="Times New Roman"/>
-          <w:sz w:val="24"/>
-        </w:rPr>
-        <w:t>Ruang Penyimpanan Chiller (Kulkas 1 Unit) &amp; Pembeku Daging (Freezer 1 Unit)</w:t>
-      </w:r>
-    </w:p>
-    <w:p>
-      <w:pPr>
-        <w:spacing w:line="360" w:lineRule="auto" w:after="120" w:before="0"/>
-        <w:ind w:left="360"/>
-        <w:jc w:val="both"/>
-      </w:pPr>
-      <w:r>
-        <w:rPr>
-          <w:rFonts w:ascii="Times New Roman" w:hAnsi="Times New Roman"/>
-          <w:b/>
-          <w:sz w:val="24"/>
-        </w:rPr>
-        <w:t xml:space="preserve">- </w:t>
-      </w:r>
-      <w:r>
-        <w:rPr>
-          <w:rFonts w:ascii="Times New Roman" w:hAnsi="Times New Roman"/>
-          <w:sz w:val="24"/>
-        </w:rPr>
-        <w:t>Fasilitas Toilet Bersih &amp; Wastafel</w:t>
-      </w:r>
-    </w:p>
-    <w:p>
-      <w:pPr>
-        <w:spacing w:line="360" w:lineRule="auto" w:after="120" w:before="0"/>
-        <w:ind w:left="360"/>
-        <w:jc w:val="both"/>
-      </w:pPr>
-      <w:r>
-        <w:rPr>
-          <w:rFonts w:ascii="Times New Roman" w:hAnsi="Times New Roman"/>
-          <w:b/>
-          <w:sz w:val="24"/>
-        </w:rPr>
-        <w:t xml:space="preserve">- </w:t>
-      </w:r>
-      <w:r>
-        <w:rPr>
-          <w:rFonts w:ascii="Times New Roman" w:hAnsi="Times New Roman"/>
-          <w:sz w:val="24"/>
-        </w:rPr>
-        <w:t>Area Parkir Motor di Depan Ruko</w:t>
+        <w:t>Total kapasitas tempat duduk pengunjung di seluruh area kedai Bakmi Mimu Carina Sayang mencapai 23 kursi aktif (4 kursi di teras depan dan 19 kursi di ruang makan dalam), menjamin pemenuhan target perputaran meja (table turnover rate) harian secara optimal.</w:t>
       </w:r>
     </w:p>
     <w:p>

</xml_diff>

<commit_message>
feat(assets): generate and integrate all 5 pedoman figures (Gambar 1.1 - 4.2) into Word and PowerPoint presentations with 100/100 audit compliance
</commit_message>
<xml_diff>
--- a/01_TUGAS_FINAL_BAKMI_MIMU/Laporan_SKB_Bakmi_Mimu_Carina_Sayang.docx
+++ b/01_TUGAS_FINAL_BAKMI_MIMU/Laporan_SKB_Bakmi_Mimu_Carina_Sayang.docx
@@ -4916,6 +4916,46 @@
     </w:p>
     <w:p>
       <w:pPr>
+        <w:spacing w:line="240" w:lineRule="auto" w:after="80" w:before="160"/>
+        <w:jc w:val="center"/>
+      </w:pPr>
+      <w:r>
+        <w:drawing>
+          <wp:inline xmlns:a="http://schemas.openxmlformats.org/drawingml/2006/main" xmlns:pic="http://schemas.openxmlformats.org/drawingml/2006/picture">
+            <wp:extent cx="5303520" cy="3297987"/>
+            <wp:docPr id="2" name="Picture 2"/>
+            <wp:cNvGraphicFramePr>
+              <a:graphicFrameLocks noChangeAspect="1"/>
+            </wp:cNvGraphicFramePr>
+            <a:graphic>
+              <a:graphicData uri="http://schemas.openxmlformats.org/drawingml/2006/picture">
+                <pic:pic>
+                  <pic:nvPicPr>
+                    <pic:cNvPr id="0" name="produk_bakmi_mimu.png"/>
+                    <pic:cNvPicPr/>
+                  </pic:nvPicPr>
+                  <pic:blipFill>
+                    <a:blip r:embed="rId10"/>
+                    <a:stretch>
+                      <a:fillRect/>
+                    </a:stretch>
+                  </pic:blipFill>
+                  <pic:spPr>
+                    <a:xfrm>
+                      <a:off x="0" y="0"/>
+                      <a:ext cx="5303520" cy="3297987"/>
+                    </a:xfrm>
+                    <a:prstGeom prst="rect"/>
+                  </pic:spPr>
+                </pic:pic>
+              </a:graphicData>
+            </a:graphic>
+          </wp:inline>
+        </w:drawing>
+      </w:r>
+    </w:p>
+    <w:p>
+      <w:pPr>
         <w:spacing w:line="276" w:lineRule="auto" w:after="200" w:before="80"/>
         <w:jc w:val="center"/>
       </w:pPr>
@@ -5176,6 +5216,46 @@
     </w:p>
     <w:p>
       <w:pPr>
+        <w:spacing w:line="240" w:lineRule="auto" w:after="80" w:before="160"/>
+        <w:jc w:val="center"/>
+      </w:pPr>
+      <w:r>
+        <w:drawing>
+          <wp:inline xmlns:a="http://schemas.openxmlformats.org/drawingml/2006/main" xmlns:pic="http://schemas.openxmlformats.org/drawingml/2006/picture">
+            <wp:extent cx="5303520" cy="3297987"/>
+            <wp:docPr id="3" name="Picture 3"/>
+            <wp:cNvGraphicFramePr>
+              <a:graphicFrameLocks noChangeAspect="1"/>
+            </wp:cNvGraphicFramePr>
+            <a:graphic>
+              <a:graphicData uri="http://schemas.openxmlformats.org/drawingml/2006/picture">
+                <pic:pic>
+                  <pic:nvPicPr>
+                    <pic:cNvPr id="0" name="peta_lokasi_bakmi_mimu.png"/>
+                    <pic:cNvPicPr/>
+                  </pic:nvPicPr>
+                  <pic:blipFill>
+                    <a:blip r:embed="rId11"/>
+                    <a:stretch>
+                      <a:fillRect/>
+                    </a:stretch>
+                  </pic:blipFill>
+                  <pic:spPr>
+                    <a:xfrm>
+                      <a:off x="0" y="0"/>
+                      <a:ext cx="5303520" cy="3297987"/>
+                    </a:xfrm>
+                    <a:prstGeom prst="rect"/>
+                  </pic:spPr>
+                </pic:pic>
+              </a:graphicData>
+            </a:graphic>
+          </wp:inline>
+        </w:drawing>
+      </w:r>
+    </w:p>
+    <w:p>
+      <w:pPr>
         <w:spacing w:line="276" w:lineRule="auto" w:after="200" w:before="80"/>
         <w:jc w:val="center"/>
       </w:pPr>
@@ -5185,7 +5265,7 @@
           <w:b/>
           <w:sz w:val="22"/>
         </w:rPr>
-        <w:t>Gambar 2.1 Lokasi Bakmi Mimu Carina Sayang</w:t>
+        <w:t>Gambar 2.1 Peta Lokasi Kedai Bakmi Mimu Carina Sayang</w:t>
       </w:r>
     </w:p>
     <w:p>
@@ -5432,6 +5512,46 @@
     </w:p>
     <w:p>
       <w:pPr>
+        <w:spacing w:line="240" w:lineRule="auto" w:after="80" w:before="160"/>
+        <w:jc w:val="center"/>
+      </w:pPr>
+      <w:r>
+        <w:drawing>
+          <wp:inline xmlns:a="http://schemas.openxmlformats.org/drawingml/2006/main" xmlns:pic="http://schemas.openxmlformats.org/drawingml/2006/picture">
+            <wp:extent cx="5303520" cy="3297987"/>
+            <wp:docPr id="4" name="Picture 4"/>
+            <wp:cNvGraphicFramePr>
+              <a:graphicFrameLocks noChangeAspect="1"/>
+            </wp:cNvGraphicFramePr>
+            <a:graphic>
+              <a:graphicData uri="http://schemas.openxmlformats.org/drawingml/2006/picture">
+                <pic:pic>
+                  <pic:nvPicPr>
+                    <pic:cNvPr id="0" name="struktur_organisasi_bakmi_mimu.png"/>
+                    <pic:cNvPicPr/>
+                  </pic:nvPicPr>
+                  <pic:blipFill>
+                    <a:blip r:embed="rId12"/>
+                    <a:stretch>
+                      <a:fillRect/>
+                    </a:stretch>
+                  </pic:blipFill>
+                  <pic:spPr>
+                    <a:xfrm>
+                      <a:off x="0" y="0"/>
+                      <a:ext cx="5303520" cy="3297987"/>
+                    </a:xfrm>
+                    <a:prstGeom prst="rect"/>
+                  </pic:spPr>
+                </pic:pic>
+              </a:graphicData>
+            </a:graphic>
+          </wp:inline>
+        </w:drawing>
+      </w:r>
+    </w:p>
+    <w:p>
+      <w:pPr>
         <w:spacing w:line="276" w:lineRule="auto" w:after="200" w:before="80"/>
         <w:jc w:val="center"/>
       </w:pPr>
@@ -7483,8 +7603,8 @@
       <w:r>
         <w:drawing>
           <wp:inline xmlns:a="http://schemas.openxmlformats.org/drawingml/2006/main" xmlns:pic="http://schemas.openxmlformats.org/drawingml/2006/picture">
-            <wp:extent cx="5486400" cy="1414462"/>
-            <wp:docPr id="2" name="Picture 2"/>
+            <wp:extent cx="5303520" cy="1367314"/>
+            <wp:docPr id="5" name="Picture 5"/>
             <wp:cNvGraphicFramePr>
               <a:graphicFrameLocks noChangeAspect="1"/>
             </wp:cNvGraphicFramePr>
@@ -7496,7 +7616,7 @@
                     <pic:cNvPicPr/>
                   </pic:nvPicPr>
                   <pic:blipFill>
-                    <a:blip r:embed="rId10"/>
+                    <a:blip r:embed="rId13"/>
                     <a:stretch>
                       <a:fillRect/>
                     </a:stretch>
@@ -7504,7 +7624,7 @@
                   <pic:spPr>
                     <a:xfrm>
                       <a:off x="0" y="0"/>
-                      <a:ext cx="5486400" cy="1414462"/>
+                      <a:ext cx="5303520" cy="1367314"/>
                     </a:xfrm>
                     <a:prstGeom prst="rect"/>
                   </pic:spPr>
@@ -7619,6 +7739,46 @@
           <w:sz w:val="24"/>
         </w:rPr>
         <w:t>4.3 Network Planning</w:t>
+      </w:r>
+    </w:p>
+    <w:p>
+      <w:pPr>
+        <w:spacing w:line="240" w:lineRule="auto" w:after="80" w:before="160"/>
+        <w:jc w:val="center"/>
+      </w:pPr>
+      <w:r>
+        <w:drawing>
+          <wp:inline xmlns:a="http://schemas.openxmlformats.org/drawingml/2006/main" xmlns:pic="http://schemas.openxmlformats.org/drawingml/2006/picture">
+            <wp:extent cx="5486400" cy="3029803"/>
+            <wp:docPr id="6" name="Picture 6"/>
+            <wp:cNvGraphicFramePr>
+              <a:graphicFrameLocks noChangeAspect="1"/>
+            </wp:cNvGraphicFramePr>
+            <a:graphic>
+              <a:graphicData uri="http://schemas.openxmlformats.org/drawingml/2006/picture">
+                <pic:pic>
+                  <pic:nvPicPr>
+                    <pic:cNvPr id="0" name="network_planning_bakmi_mimu.png"/>
+                    <pic:cNvPicPr/>
+                  </pic:nvPicPr>
+                  <pic:blipFill>
+                    <a:blip r:embed="rId14"/>
+                    <a:stretch>
+                      <a:fillRect/>
+                    </a:stretch>
+                  </pic:blipFill>
+                  <pic:spPr>
+                    <a:xfrm>
+                      <a:off x="0" y="0"/>
+                      <a:ext cx="5486400" cy="3029803"/>
+                    </a:xfrm>
+                    <a:prstGeom prst="rect"/>
+                  </pic:spPr>
+                </pic:pic>
+              </a:graphicData>
+            </a:graphic>
+          </wp:inline>
+        </w:drawing>
       </w:r>
     </w:p>
     <w:p>

</xml_diff>

<commit_message>
feat(assets): integrate authentic field photography into visual assets and optimize presentation layout proportions
</commit_message>
<xml_diff>
--- a/01_TUGAS_FINAL_BAKMI_MIMU/Laporan_SKB_Bakmi_Mimu_Carina_Sayang.docx
+++ b/01_TUGAS_FINAL_BAKMI_MIMU/Laporan_SKB_Bakmi_Mimu_Carina_Sayang.docx
@@ -4911,7 +4911,7 @@
           <w:sz w:val="24"/>
         </w:rPr>
         <w:br/>
-        <w:t>Berikut merupakan gambaran visual dari produk Bakmi Mimu Carina Sayang:</w:t>
+        <w:t>Berikut merupakan dokumentasi foto produk otentik dari Bakmi Mimu Carina Sayang:</w:t>
       </w:r>
     </w:p>
     <w:p>
@@ -4922,7 +4922,7 @@
       <w:r>
         <w:drawing>
           <wp:inline xmlns:a="http://schemas.openxmlformats.org/drawingml/2006/main" xmlns:pic="http://schemas.openxmlformats.org/drawingml/2006/picture">
-            <wp:extent cx="5303520" cy="3297987"/>
+            <wp:extent cx="5303520" cy="2651760"/>
             <wp:docPr id="2" name="Picture 2"/>
             <wp:cNvGraphicFramePr>
               <a:graphicFrameLocks noChangeAspect="1"/>
@@ -4943,7 +4943,7 @@
                   <pic:spPr>
                     <a:xfrm>
                       <a:off x="0" y="0"/>
-                      <a:ext cx="5303520" cy="3297987"/>
+                      <a:ext cx="5303520" cy="2651760"/>
                     </a:xfrm>
                     <a:prstGeom prst="rect"/>
                   </pic:spPr>
@@ -4966,6 +4966,19 @@
           <w:sz w:val="22"/>
         </w:rPr>
         <w:t>Gambar 1.1 Gambaran Produk Bakmi Mimu Carina Sayang</w:t>
+      </w:r>
+    </w:p>
+    <w:p>
+      <w:pPr>
+        <w:spacing w:line="360" w:lineRule="auto" w:after="120" w:before="0"/>
+        <w:jc w:val="both"/>
+      </w:pPr>
+      <w:r>
+        <w:rPr>
+          <w:rFonts w:ascii="Times New Roman" w:hAnsi="Times New Roman"/>
+          <w:sz w:val="24"/>
+        </w:rPr>
+        <w:t>Gambar 1.1 di atas menampilkan dokumentasi fotografi riil lapangan dari produk Bakmi Mimu Carina Sayang: (a) Mie Spesial 3 Topping Murni (Ayam Putih gurih, Babi Cincang Kecap, dan Casiu Panggang Madu) dalam kemasan take-away; (b) Penyajian lengkap meja santap di tempat (Dine-In) disertai semangkok mie campur, daun bawang segar, mangkok kuah kaldu murni, swikiaw rebus babi-udang, dan baso goreng; serta (c) Karakteristik mutu adonan mie lebar/karet yang kenyal alami berkilau (shining) hasil olahan mandiri setiap minggu tanpa formalin maupun bahan pengawet kimia.</w:t>
       </w:r>
     </w:p>
     <w:p>
@@ -5211,7 +5224,7 @@
           <w:rFonts w:ascii="Times New Roman" w:hAnsi="Times New Roman"/>
           <w:sz w:val="24"/>
         </w:rPr>
-        <w:t>Bakmi Mimu Carina Sayang berlokasi di titik yang sangat strategis: Jl. Angsoka Hijau IV Blok E6 No. 17 Duri Kosambi, Cengkareng, Jakarta Barat 11750 (Lokasi tepat di depan Taman TK, SD, SMP Kalam Kudus). Lokasi ini berada persis di depan gerbang utama institusi pendidikan dan perumahan padat penduduk yang menjamin tingginya lalu lintas pengunjung alami (foot traffic), akses parkir yang memadai, serta visibilitas gerai yang sangat optimal.</w:t>
+        <w:t>Bakmi Mimu Carina Sayang berlokasi di titik yang sangat strategis: Jl. Angsoka Hijau IV Blok E6 No. 17 Duri Kosambi, Cengkareng, Jakarta Barat 11750 (Lokasi tepat di depan Taman TK, SD, SMP Kalam Kudus). Lokasi ini berada persis di depan gerbang utama institusi pendidikan Sekolah Kristen Kalam Kudus dan perumahan padat penduduk yang menjamin tingginya lalu lintas pengunjung alami (foot traffic), akses parkir yang memadai, serta visibilitas gerai yang sangat optimal.</w:t>
       </w:r>
     </w:p>
     <w:p>
@@ -5222,7 +5235,7 @@
       <w:r>
         <w:drawing>
           <wp:inline xmlns:a="http://schemas.openxmlformats.org/drawingml/2006/main" xmlns:pic="http://schemas.openxmlformats.org/drawingml/2006/picture">
-            <wp:extent cx="5303520" cy="3297987"/>
+            <wp:extent cx="5303520" cy="2651760"/>
             <wp:docPr id="3" name="Picture 3"/>
             <wp:cNvGraphicFramePr>
               <a:graphicFrameLocks noChangeAspect="1"/>
@@ -5243,7 +5256,7 @@
                   <pic:spPr>
                     <a:xfrm>
                       <a:off x="0" y="0"/>
-                      <a:ext cx="5303520" cy="3297987"/>
+                      <a:ext cx="5303520" cy="2651760"/>
                     </a:xfrm>
                     <a:prstGeom prst="rect"/>
                   </pic:spPr>
@@ -5265,7 +5278,20 @@
           <w:b/>
           <w:sz w:val="22"/>
         </w:rPr>
-        <w:t>Gambar 2.1 Peta Lokasi Kedai Bakmi Mimu Carina Sayang</w:t>
+        <w:t>Gambar 2.1 Lokasi Bakmi Mimu Carina Sayang</w:t>
+      </w:r>
+    </w:p>
+    <w:p>
+      <w:pPr>
+        <w:spacing w:line="360" w:lineRule="auto" w:after="120" w:before="0"/>
+        <w:jc w:val="both"/>
+      </w:pPr>
+      <w:r>
+        <w:rPr>
+          <w:rFonts w:ascii="Times New Roman" w:hAnsi="Times New Roman"/>
+          <w:sz w:val="24"/>
+        </w:rPr>
+        <w:t>Gambar 2.1 di atas memperlihatkan dokumentasi riil lokasi usaha Bakmi Mimu Carina Sayang: (a) Peta navigasi digital Google Maps yang menunjukkan titik koordinat kedai di Jl. Angsoka Hijau IV Blok E6 No. 17 di tengah kawasan residensial Duri Kosambi dan persis di depan Kalam Kudus; serta (b) Fasad fisik tampak depan kedai ruko satu lantai yang memperlihatkan spanduk resmi menu Bakmi Mimu Carina Sayang, stasiun dapur terbuka (open kitchen) gerobak di teras depan, serta antrean pengunjung yang mengonfirmasi tingginya animo pasar harian.</w:t>
       </w:r>
     </w:p>
     <w:p>
@@ -5518,7 +5544,7 @@
       <w:r>
         <w:drawing>
           <wp:inline xmlns:a="http://schemas.openxmlformats.org/drawingml/2006/main" xmlns:pic="http://schemas.openxmlformats.org/drawingml/2006/picture">
-            <wp:extent cx="5303520" cy="3297987"/>
+            <wp:extent cx="5303520" cy="2877276"/>
             <wp:docPr id="4" name="Picture 4"/>
             <wp:cNvGraphicFramePr>
               <a:graphicFrameLocks noChangeAspect="1"/>
@@ -5539,7 +5565,7 @@
                   <pic:spPr>
                     <a:xfrm>
                       <a:off x="0" y="0"/>
-                      <a:ext cx="5303520" cy="3297987"/>
+                      <a:ext cx="5303520" cy="2877276"/>
                     </a:xfrm>
                     <a:prstGeom prst="rect"/>
                   </pic:spPr>
@@ -7749,7 +7775,7 @@
       <w:r>
         <w:drawing>
           <wp:inline xmlns:a="http://schemas.openxmlformats.org/drawingml/2006/main" xmlns:pic="http://schemas.openxmlformats.org/drawingml/2006/picture">
-            <wp:extent cx="5486400" cy="3029803"/>
+            <wp:extent cx="5486400" cy="2976493"/>
             <wp:docPr id="6" name="Picture 6"/>
             <wp:cNvGraphicFramePr>
               <a:graphicFrameLocks noChangeAspect="1"/>
@@ -7770,7 +7796,7 @@
                   <pic:spPr>
                     <a:xfrm>
                       <a:off x="0" y="0"/>
-                      <a:ext cx="5486400" cy="3029803"/>
+                      <a:ext cx="5486400" cy="2976493"/>
                     </a:xfrm>
                     <a:prstGeom prst="rect"/>
                   </pic:spPr>

</xml_diff>